<commit_message>
Dodaj część 3 projektu (rozdz. 1–5, 6.1, nagłówek 6.2); zdjęcie do rysunku 5
Co-Authored-By: Claude Opus 5.5 <noreply@anthropic.com>
Claude-Session: https://claude.ai/code/session_01QehAftz7E7q6ro6WRzRWTg
</commit_message>
<xml_diff>
--- a/Projekt_wymiana_klockow_Toyota_Corolla_E12.docx
+++ b/Projekt_wymiana_klockow_Toyota_Corolla_E12.docx
@@ -11442,78 +11442,56 @@
           <w:sz w:val="22"/>
           <w:szCs w:val="22"/>
         </w:rPr>
-        <w:t xml:space="preserve">Na rysunku numer 5 poniżej pokazano zużyte klocki po demontażu zacisku.</w:t>
+        <w:t xml:space="preserve">Na rysunku numer 5 poniżej pokazano demontaż klocków z jarzma zacisku – po nim mierzy się grubość okładzin obu klocków.</w:t>
       </w:r>
     </w:p>
-    <w:tbl>
-      <w:tblPr>
-        <w:tblW w:type="dxa" w:w="7000"/>
+    <w:p>
+      <w:pPr>
+        <w:keepNext/>
+        <w:spacing w:after="60"/>
         <w:jc w:val="center"/>
-        <w:tblBorders>
-          <w:top w:val="single" w:color="auto" w:sz="4"/>
-          <w:left w:val="single" w:color="auto" w:sz="4"/>
-          <w:bottom w:val="single" w:color="auto" w:sz="4"/>
-          <w:right w:val="single" w:color="auto" w:sz="4"/>
-          <w:insideH w:val="single" w:color="auto" w:sz="4"/>
-          <w:insideV w:val="single" w:color="auto" w:sz="4"/>
-        </w:tblBorders>
-      </w:tblPr>
-      <w:tblGrid>
-        <w:gridCol w:w="7000"/>
-      </w:tblGrid>
-      <w:tr>
-        <w:trPr>
-          <w:trHeight w:val="3200" w:hRule="atLeast"/>
-        </w:trPr>
-        <w:tc>
-          <w:tcPr>
-            <w:tcW w:type="dxa" w:w="7000"/>
-            <w:tcBorders>
-              <w:top w:val="dashed" w:color="8C8C8C" w:sz="6"/>
-              <w:left w:val="dashed" w:color="8C8C8C" w:sz="6"/>
-              <w:bottom w:val="dashed" w:color="8C8C8C" w:sz="6"/>
-              <w:right w:val="dashed" w:color="8C8C8C" w:sz="6"/>
-            </w:tcBorders>
-            <w:shd w:fill="F2F2F2" w:color="auto" w:val="clear"/>
-            <w:vAlign w:val="center"/>
-          </w:tcPr>
-          <w:p>
-            <w:pPr>
-              <w:spacing w:after="40" w:before="0" w:line="276"/>
-              <w:jc w:val="center"/>
-            </w:pPr>
-            <w:r>
-              <w:rPr>
-                <w:rFonts w:ascii="Calibri" w:cs="Calibri" w:eastAsia="Calibri" w:hAnsi="Calibri"/>
-                <w:b/>
-                <w:bCs/>
-                <w:color w:val="808080"/>
-                <w:sz w:val="18"/>
-                <w:szCs w:val="18"/>
-              </w:rPr>
-              <w:t xml:space="preserve">MIEJSCE NA ZDJĘCIE</w:t>
-            </w:r>
-          </w:p>
-          <w:p>
-            <w:pPr>
-              <w:spacing w:after="0" w:before="0" w:line="276"/>
-              <w:jc w:val="center"/>
-            </w:pPr>
-            <w:r>
-              <w:rPr>
-                <w:rFonts w:ascii="Calibri" w:cs="Calibri" w:eastAsia="Calibri" w:hAnsi="Calibri"/>
-                <w:i/>
-                <w:iCs/>
-                <w:color w:val="808080"/>
-                <w:sz w:val="16"/>
-                <w:szCs w:val="16"/>
-              </w:rPr>
-              <w:t xml:space="preserve">Zużyte klocki po zdjęciu zacisku – kadr z poradnika / filmu AUTODOC [2], [3]</w:t>
-            </w:r>
-          </w:p>
-        </w:tc>
-      </w:tr>
-    </w:tbl>
+      </w:pPr>
+      <w:r>
+        <w:drawing>
+          <wp:inline distT="0" distB="0" distL="0" distR="0">
+            <wp:extent cx="3810000" cy="1924050"/>
+            <wp:effectExtent t="0" r="0" b="0" l="0"/>
+            <wp:docPr id="1" name="" descr="" title=""/>
+            <wp:cNvGraphicFramePr>
+              <a:graphicFrameLocks xmlns:a="http://schemas.openxmlformats.org/drawingml/2006/main" noChangeAspect="1"/>
+            </wp:cNvGraphicFramePr>
+            <a:graphic xmlns:a="http://schemas.openxmlformats.org/drawingml/2006/main">
+              <a:graphicData uri="http://schemas.openxmlformats.org/drawingml/2006/picture">
+                <pic:pic xmlns:pic="http://schemas.openxmlformats.org/drawingml/2006/picture">
+                  <pic:nvPicPr>
+                    <pic:cNvPr id="0" name="" descr=""/>
+                    <pic:cNvPicPr>
+                      <a:picLocks noChangeAspect="1" noChangeArrowheads="1"/>
+                    </pic:cNvPicPr>
+                  </pic:nvPicPr>
+                  <pic:blipFill>
+                    <a:blip r:embed="rId13" cstate="none"/>
+                    <a:srcRect/>
+                    <a:stretch>
+                      <a:fillRect/>
+                    </a:stretch>
+                  </pic:blipFill>
+                  <pic:spPr bwMode="auto">
+                    <a:xfrm>
+                      <a:off x="0" y="0"/>
+                      <a:ext cx="3810000" cy="1924050"/>
+                    </a:xfrm>
+                    <a:prstGeom prst="rect">
+                      <a:avLst/>
+                    </a:prstGeom>
+                  </pic:spPr>
+                </pic:pic>
+              </a:graphicData>
+            </a:graphic>
+          </wp:inline>
+        </w:drawing>
+      </w:r>
+    </w:p>
     <w:p>
       <w:pPr>
         <w:spacing w:after="200" w:before="0" w:line="276"/>
@@ -11527,7 +11505,7 @@
           <w:sz w:val="18"/>
           <w:szCs w:val="18"/>
         </w:rPr>
-        <w:t xml:space="preserve">Rysunek 5. Zużyte okładziny klocków hamulcowych osi przedniej, [2]</w:t>
+        <w:t xml:space="preserve">Rysunek 5. Demontaż klocków hamulcowych osi przedniej z jarzma zacisku, [2]</w:t>
       </w:r>
     </w:p>
     <w:p>
@@ -14837,7 +14815,7 @@
                     </pic:cNvPicPr>
                   </pic:nvPicPr>
                   <pic:blipFill>
-                    <a:blip r:embed="rId13" cstate="none"/>
+                    <a:blip r:embed="rId14" cstate="none"/>
                     <a:srcRect/>
                     <a:stretch>
                       <a:fillRect/>

</xml_diff>